<commit_message>
Estadualização: Borba/Mapiá, AM-454 e Novo Céu com traçado, lei em anexo; OAE 2011 conferida; textos sem dado simplificados
Co-Authored-By: Claude Opus 5 <noreply@anthropic.com>
</commit_message>
<xml_diff>
--- a/documentos/Resumo_Referencia_Rodovias.docx
+++ b/documentos/Resumo_Referencia_Rodovias.docx
@@ -385,13 +385,13 @@
             </w:rPr>
             <w:fldChar w:fldCharType="separate"/>
           </w:r>
-          <w:hyperlink w:anchor="__RefHeading___Toc110073_720438169" w:tooltip="1 Rodovias estaduais">
+          <w:hyperlink w:anchor="__RefHeading___Toc35786_2662203589" w:tooltip="1. Rodovias estaduais">
             <w:r>
               <w:rPr>
                 <w:rStyle w:val="Vnculodendice"/>
                 <w:webHidden/>
               </w:rPr>
-              <w:t>1 Rodovias estaduais</w:t>
+              <w:t>1. Rodovias estaduais</w:t>
               <w:tab/>
               <w:t>4</w:t>
             </w:r>
@@ -406,13 +406,13 @@
             </w:tabs>
             <w:rPr/>
           </w:pPr>
-          <w:hyperlink w:anchor="__RefHeading___Toc110075_720438169" w:tooltip="2 Rodovias federais no Amazonas">
+          <w:hyperlink w:anchor="__RefHeading___Toc35788_2662203589" w:tooltip="2. Rodovias federais no Amazonas">
             <w:r>
               <w:rPr>
                 <w:rStyle w:val="Vnculodendice"/>
                 <w:webHidden/>
               </w:rPr>
-              <w:t>2 Rodovias federais no Amazonas</w:t>
+              <w:t>2. Rodovias federais no Amazonas</w:t>
               <w:tab/>
               <w:t>6</w:t>
             </w:r>
@@ -427,13 +427,13 @@
             </w:tabs>
             <w:rPr/>
           </w:pPr>
-          <w:hyperlink w:anchor="__RefHeading___Toc110077_720438169" w:tooltip="3 Ramais e estradas vicinais">
+          <w:hyperlink w:anchor="__RefHeading___Toc35790_2662203589" w:tooltip="3. Ramais e estradas vicinais">
             <w:r>
               <w:rPr>
                 <w:rStyle w:val="Vnculodendice"/>
                 <w:webHidden/>
               </w:rPr>
-              <w:t>3 Ramais e estradas vicinais</w:t>
+              <w:t>3. Ramais e estradas vicinais</w:t>
               <w:tab/>
               <w:t>6</w:t>
             </w:r>
@@ -448,13 +448,13 @@
             </w:tabs>
             <w:rPr/>
           </w:pPr>
-          <w:hyperlink w:anchor="__RefHeading___Toc110079_720438169" w:tooltip="4 Obras de arte especiais">
+          <w:hyperlink w:anchor="__RefHeading___Toc35792_2662203589" w:tooltip="4. Obras de arte especiais">
             <w:r>
               <w:rPr>
                 <w:rStyle w:val="Vnculodendice"/>
                 <w:webHidden/>
               </w:rPr>
-              <w:t>4 Obras de arte especiais</w:t>
+              <w:t>4. Obras de arte especiais</w:t>
               <w:tab/>
               <w:t>8</w:t>
             </w:r>
@@ -469,36 +469,15 @@
             </w:tabs>
             <w:rPr/>
           </w:pPr>
-          <w:hyperlink w:anchor="__RefHeading___Toc110081_720438169" w:tooltip="5 Estadualização de estradas vicinais">
+          <w:hyperlink w:anchor="__RefHeading___Toc35794_2662203589" w:tooltip="5. Estadualização de estradas vicinais">
             <w:r>
               <w:rPr>
                 <w:rStyle w:val="Vnculodendice"/>
                 <w:webHidden/>
               </w:rPr>
-              <w:t>5 Estadualização de estradas vicinais</w:t>
+              <w:t>5. Estadualização de estradas vicinais</w:t>
               <w:tab/>
               <w:t>8</w:t>
-            </w:r>
-          </w:hyperlink>
-        </w:p>
-        <w:p>
-          <w:pPr>
-            <w:pStyle w:val="TOC1"/>
-            <w:tabs>
-              <w:tab w:val="clear" w:pos="9071"/>
-              <w:tab w:val="right" w:pos="9070" w:leader="dot"/>
-            </w:tabs>
-            <w:rPr/>
-          </w:pPr>
-          <w:hyperlink w:anchor="__RefHeading___Toc110083_720438169" w:tooltip="6 Dez números para citar">
-            <w:r>
-              <w:rPr>
-                <w:rStyle w:val="Vnculodendice"/>
-                <w:webHidden/>
-              </w:rPr>
-              <w:t>6 Dez números para citar</w:t>
-              <w:tab/>
-              <w:t>9</w:t>
             </w:r>
           </w:hyperlink>
           <w:r>
@@ -532,11 +511,11 @@
         <w:spacing w:before="0" w:after="160"/>
         <w:rPr/>
       </w:pPr>
-      <w:bookmarkStart w:id="0" w:name="__RefHeading___Toc110073_720438169"/>
+      <w:bookmarkStart w:id="0" w:name="__RefHeading___Toc35786_2662203589"/>
       <w:bookmarkEnd w:id="0"/>
       <w:r>
         <w:rPr/>
-        <w:t>1 Rodovias estaduais</w:t>
+        <w:t>1. Rodovias estaduais</w:t>
       </w:r>
     </w:p>
     <w:tbl>
@@ -8307,11 +8286,11 @@
         </w:pBdr>
         <w:rPr/>
       </w:pPr>
-      <w:bookmarkStart w:id="1" w:name="__RefHeading___Toc110075_720438169"/>
+      <w:bookmarkStart w:id="1" w:name="__RefHeading___Toc35788_2662203589"/>
       <w:bookmarkEnd w:id="1"/>
       <w:r>
         <w:rPr/>
-        <w:t>2 Rodovias federais no Amazonas</w:t>
+        <w:t>2. Rodovias federais no Amazonas</w:t>
       </w:r>
     </w:p>
     <w:tbl>
@@ -10984,11 +10963,11 @@
         </w:pBdr>
         <w:rPr/>
       </w:pPr>
-      <w:bookmarkStart w:id="2" w:name="__RefHeading___Toc110077_720438169"/>
+      <w:bookmarkStart w:id="2" w:name="__RefHeading___Toc35790_2662203589"/>
       <w:bookmarkEnd w:id="2"/>
       <w:r>
         <w:rPr/>
-        <w:t>3 Ramais e estradas vicinais</w:t>
+        <w:t>3. Ramais e estradas vicinais</w:t>
       </w:r>
     </w:p>
     <w:tbl>
@@ -18005,11 +17984,11 @@
         </w:pBdr>
         <w:rPr/>
       </w:pPr>
-      <w:bookmarkStart w:id="3" w:name="__RefHeading___Toc110079_720438169"/>
+      <w:bookmarkStart w:id="3" w:name="__RefHeading___Toc35792_2662203589"/>
       <w:bookmarkEnd w:id="3"/>
       <w:r>
         <w:rPr/>
-        <w:t>4 Obras de arte especiais</w:t>
+        <w:t>4. Obras de arte especiais</w:t>
       </w:r>
     </w:p>
     <w:tbl>
@@ -18057,7 +18036,7 @@
                 <w:color w:val="1A2B5E"/>
                 <w:sz w:val="34"/>
               </w:rPr>
-              <w:t>38</w:t>
+              <w:t>42</w:t>
             </w:r>
           </w:p>
         </w:tc>
@@ -18085,7 +18064,7 @@
                 <w:color w:val="1A2B5E"/>
                 <w:sz w:val="34"/>
               </w:rPr>
-              <w:t>28</w:t>
+              <w:t>32</w:t>
             </w:r>
           </w:p>
         </w:tc>
@@ -18256,7 +18235,7 @@
                 <w:color w:val="1A2B5E"/>
                 <w:sz w:val="34"/>
               </w:rPr>
-              <w:t>8</w:t>
+              <w:t>9</w:t>
             </w:r>
           </w:p>
         </w:tc>
@@ -18284,7 +18263,7 @@
                 <w:color w:val="1A2B5E"/>
                 <w:sz w:val="34"/>
               </w:rPr>
-              <w:t>26</w:t>
+              <w:t>25</w:t>
             </w:r>
           </w:p>
         </w:tc>
@@ -18633,7 +18612,7 @@
                 <w:b w:val="false"/>
                 <w:sz w:val="19"/>
               </w:rPr>
-              <w:t>17</w:t>
+              <w:t>19</w:t>
             </w:r>
           </w:p>
         </w:tc>
@@ -18659,7 +18638,7 @@
                 <w:b w:val="false"/>
                 <w:sz w:val="19"/>
               </w:rPr>
-              <w:t>10 pontes, 3 viadutos, 3 trevos, 1 alça</w:t>
+              <w:t>12 pontes, 3 viadutos, 3 trevos, 1 alça</w:t>
             </w:r>
           </w:p>
         </w:tc>
@@ -18744,7 +18723,7 @@
                 <w:b w:val="false"/>
                 <w:sz w:val="19"/>
               </w:rPr>
-              <w:t>4</w:t>
+              <w:t>5</w:t>
             </w:r>
           </w:p>
         </w:tc>
@@ -18771,7 +18750,7 @@
                 <w:b w:val="false"/>
                 <w:sz w:val="19"/>
               </w:rPr>
-              <w:t>2 viadutos, 1 ponte, 1 trevo</w:t>
+              <w:t>2 viadutos, 2 pontes, 1 trevo</w:t>
             </w:r>
           </w:p>
         </w:tc>
@@ -19273,7 +19252,7 @@
                 <w:b w:val="false"/>
                 <w:sz w:val="19"/>
               </w:rPr>
-              <w:t>AM-450</w:t>
+              <w:t>AM-364</w:t>
             </w:r>
           </w:p>
         </w:tc>
@@ -19299,7 +19278,7 @@
                 <w:b w:val="false"/>
                 <w:sz w:val="19"/>
               </w:rPr>
-              <w:t>5</w:t>
+              <w:t>1</w:t>
             </w:r>
           </w:p>
         </w:tc>
@@ -19325,7 +19304,7 @@
                 <w:b w:val="false"/>
                 <w:sz w:val="19"/>
               </w:rPr>
-              <w:t>5 pontes</w:t>
+              <w:t>1 ponte</w:t>
             </w:r>
           </w:p>
         </w:tc>
@@ -19351,7 +19330,7 @@
                 <w:b w:val="false"/>
                 <w:sz w:val="19"/>
               </w:rPr>
-              <w:t>2</w:t>
+              <w:t>—</w:t>
             </w:r>
           </w:p>
         </w:tc>
@@ -19383,6 +19362,118 @@
                 <w:b w:val="false"/>
                 <w:sz w:val="19"/>
               </w:rPr>
+              <w:t>AM-450</w:t>
+            </w:r>
+          </w:p>
+        </w:tc>
+        <w:tc>
+          <w:tcPr>
+            <w:tcW w:w="2268" w:type="dxa"/>
+            <w:tcBorders>
+              <w:top w:val="single" w:sz="6" w:space="0" w:color="D4DBE2"/>
+              <w:left w:val="single" w:sz="6" w:space="0" w:color="D4DBE2"/>
+              <w:bottom w:val="single" w:sz="6" w:space="0" w:color="D4DBE2"/>
+              <w:right w:val="single" w:sz="6" w:space="0" w:color="D4DBE2"/>
+            </w:tcBorders>
+            <w:shd w:color="auto" w:fill="F2F4F6" w:val="clear"/>
+          </w:tcPr>
+          <w:p>
+            <w:pPr>
+              <w:pStyle w:val="Normal"/>
+              <w:spacing w:lineRule="auto" w:line="240" w:before="20" w:after="20"/>
+              <w:jc w:val="right"/>
+              <w:rPr/>
+            </w:pPr>
+            <w:r>
+              <w:rPr>
+                <w:b w:val="false"/>
+                <w:sz w:val="19"/>
+              </w:rPr>
+              <w:t>5</w:t>
+            </w:r>
+          </w:p>
+        </w:tc>
+        <w:tc>
+          <w:tcPr>
+            <w:tcW w:w="2268" w:type="dxa"/>
+            <w:tcBorders>
+              <w:top w:val="single" w:sz="6" w:space="0" w:color="D4DBE2"/>
+              <w:left w:val="single" w:sz="6" w:space="0" w:color="D4DBE2"/>
+              <w:bottom w:val="single" w:sz="6" w:space="0" w:color="D4DBE2"/>
+              <w:right w:val="single" w:sz="6" w:space="0" w:color="D4DBE2"/>
+            </w:tcBorders>
+            <w:shd w:color="auto" w:fill="F2F4F6" w:val="clear"/>
+          </w:tcPr>
+          <w:p>
+            <w:pPr>
+              <w:pStyle w:val="Normal"/>
+              <w:spacing w:lineRule="auto" w:line="240" w:before="20" w:after="20"/>
+              <w:jc w:val="left"/>
+              <w:rPr/>
+            </w:pPr>
+            <w:r>
+              <w:rPr>
+                <w:b w:val="false"/>
+                <w:sz w:val="19"/>
+              </w:rPr>
+              <w:t>5 pontes</w:t>
+            </w:r>
+          </w:p>
+        </w:tc>
+        <w:tc>
+          <w:tcPr>
+            <w:tcW w:w="2268" w:type="dxa"/>
+            <w:tcBorders>
+              <w:top w:val="single" w:sz="6" w:space="0" w:color="D4DBE2"/>
+              <w:left w:val="single" w:sz="6" w:space="0" w:color="D4DBE2"/>
+              <w:bottom w:val="single" w:sz="6" w:space="0" w:color="D4DBE2"/>
+              <w:right w:val="single" w:sz="6" w:space="0" w:color="D4DBE2"/>
+            </w:tcBorders>
+            <w:shd w:color="auto" w:fill="F2F4F6" w:val="clear"/>
+          </w:tcPr>
+          <w:p>
+            <w:pPr>
+              <w:pStyle w:val="Normal"/>
+              <w:spacing w:lineRule="auto" w:line="240" w:before="20" w:after="20"/>
+              <w:jc w:val="right"/>
+              <w:rPr/>
+            </w:pPr>
+            <w:r>
+              <w:rPr>
+                <w:b w:val="false"/>
+                <w:sz w:val="19"/>
+              </w:rPr>
+              <w:t>2</w:t>
+            </w:r>
+          </w:p>
+        </w:tc>
+      </w:tr>
+      <w:tr>
+        <w:trPr>
+          <w:cantSplit/>
+        </w:trPr>
+        <w:tc>
+          <w:tcPr>
+            <w:tcW w:w="2268" w:type="dxa"/>
+            <w:tcBorders>
+              <w:top w:val="single" w:sz="6" w:space="0" w:color="D4DBE2"/>
+              <w:left w:val="single" w:sz="6" w:space="0" w:color="D4DBE2"/>
+              <w:bottom w:val="single" w:sz="6" w:space="0" w:color="D4DBE2"/>
+              <w:right w:val="single" w:sz="6" w:space="0" w:color="D4DBE2"/>
+            </w:tcBorders>
+          </w:tcPr>
+          <w:p>
+            <w:pPr>
+              <w:pStyle w:val="Normal"/>
+              <w:spacing w:lineRule="auto" w:line="240" w:before="20" w:after="20"/>
+              <w:jc w:val="left"/>
+              <w:rPr/>
+            </w:pPr>
+            <w:r>
+              <w:rPr>
+                <w:b w:val="false"/>
+                <w:sz w:val="19"/>
+              </w:rPr>
               <w:t>AM-453</w:t>
             </w:r>
           </w:p>
@@ -19396,7 +19487,6 @@
               <w:bottom w:val="single" w:sz="6" w:space="0" w:color="D4DBE2"/>
               <w:right w:val="single" w:sz="6" w:space="0" w:color="D4DBE2"/>
             </w:tcBorders>
-            <w:shd w:color="auto" w:fill="F2F4F6" w:val="clear"/>
           </w:tcPr>
           <w:p>
             <w:pPr>
@@ -19423,7 +19513,6 @@
               <w:bottom w:val="single" w:sz="6" w:space="0" w:color="D4DBE2"/>
               <w:right w:val="single" w:sz="6" w:space="0" w:color="D4DBE2"/>
             </w:tcBorders>
-            <w:shd w:color="auto" w:fill="F2F4F6" w:val="clear"/>
           </w:tcPr>
           <w:p>
             <w:pPr>
@@ -19450,7 +19539,6 @@
               <w:bottom w:val="single" w:sz="6" w:space="0" w:color="D4DBE2"/>
               <w:right w:val="single" w:sz="6" w:space="0" w:color="D4DBE2"/>
             </w:tcBorders>
-            <w:shd w:color="auto" w:fill="F2F4F6" w:val="clear"/>
           </w:tcPr>
           <w:p>
             <w:pPr>
@@ -19494,11 +19582,11 @@
         </w:pBdr>
         <w:rPr/>
       </w:pPr>
-      <w:bookmarkStart w:id="4" w:name="__RefHeading___Toc110081_720438169"/>
+      <w:bookmarkStart w:id="4" w:name="__RefHeading___Toc35794_2662203589"/>
       <w:bookmarkEnd w:id="4"/>
       <w:r>
         <w:rPr/>
-        <w:t>5 Estadualização de estradas vicinais</w:t>
+        <w:t>5. Estadualização de estradas vicinais</w:t>
       </w:r>
     </w:p>
     <w:tbl>
@@ -19602,7 +19690,7 @@
                 <w:color w:val="1A2B5E"/>
                 <w:sz w:val="34"/>
               </w:rPr>
-              <w:t>10</w:t>
+              <w:t>11</w:t>
             </w:r>
           </w:p>
         </w:tc>
@@ -19717,7 +19805,7 @@
                 <w:color w:val="1A2B5E"/>
                 <w:sz w:val="34"/>
               </w:rPr>
-              <w:t>291,6 km</w:t>
+              <w:t>315,6 km</w:t>
             </w:r>
           </w:p>
         </w:tc>
@@ -21437,7 +21525,7 @@
                 <w:b w:val="false"/>
                 <w:sz w:val="19"/>
               </w:rPr>
-              <w:t>Estrada Anori/Anamã/Codajás</w:t>
+              <w:t>Estrada Anori/Codajás</w:t>
             </w:r>
           </w:p>
         </w:tc>
@@ -21463,7 +21551,7 @@
                 <w:b w:val="false"/>
                 <w:sz w:val="19"/>
               </w:rPr>
-              <w:t>Anori, Anamã e Codajás</w:t>
+              <w:t>Anori e Codajás</w:t>
             </w:r>
           </w:p>
         </w:tc>
@@ -22074,6 +22162,116 @@
             </w:pPr>
             <w:r>
               <w:rPr>
+                <w:b w:val="false"/>
+                <w:sz w:val="19"/>
+              </w:rPr>
+              <w:t>AM-149</w:t>
+            </w:r>
+          </w:p>
+        </w:tc>
+        <w:tc>
+          <w:tcPr>
+            <w:tcW w:w="2268" w:type="dxa"/>
+            <w:tcBorders>
+              <w:top w:val="single" w:sz="6" w:space="0" w:color="D4DBE2"/>
+              <w:left w:val="single" w:sz="6" w:space="0" w:color="D4DBE2"/>
+              <w:bottom w:val="single" w:sz="6" w:space="0" w:color="D4DBE2"/>
+              <w:right w:val="single" w:sz="6" w:space="0" w:color="D4DBE2"/>
+            </w:tcBorders>
+          </w:tcPr>
+          <w:p>
+            <w:pPr>
+              <w:pStyle w:val="Normal"/>
+              <w:spacing w:lineRule="auto" w:line="240" w:before="20" w:after="20"/>
+              <w:jc w:val="left"/>
+              <w:rPr/>
+            </w:pPr>
+            <w:r>
+              <w:rPr>
+                <w:b w:val="false"/>
+                <w:sz w:val="19"/>
+              </w:rPr>
+              <w:t>Estrada Borba/Mapiá</w:t>
+            </w:r>
+          </w:p>
+        </w:tc>
+        <w:tc>
+          <w:tcPr>
+            <w:tcW w:w="2268" w:type="dxa"/>
+            <w:tcBorders>
+              <w:top w:val="single" w:sz="6" w:space="0" w:color="D4DBE2"/>
+              <w:left w:val="single" w:sz="6" w:space="0" w:color="D4DBE2"/>
+              <w:bottom w:val="single" w:sz="6" w:space="0" w:color="D4DBE2"/>
+              <w:right w:val="single" w:sz="6" w:space="0" w:color="D4DBE2"/>
+            </w:tcBorders>
+          </w:tcPr>
+          <w:p>
+            <w:pPr>
+              <w:pStyle w:val="Normal"/>
+              <w:spacing w:lineRule="auto" w:line="240" w:before="20" w:after="20"/>
+              <w:jc w:val="left"/>
+              <w:rPr/>
+            </w:pPr>
+            <w:r>
+              <w:rPr>
+                <w:b w:val="false"/>
+                <w:sz w:val="19"/>
+              </w:rPr>
+              <w:t>Borba</w:t>
+            </w:r>
+          </w:p>
+        </w:tc>
+        <w:tc>
+          <w:tcPr>
+            <w:tcW w:w="2268" w:type="dxa"/>
+            <w:tcBorders>
+              <w:top w:val="single" w:sz="6" w:space="0" w:color="D4DBE2"/>
+              <w:left w:val="single" w:sz="6" w:space="0" w:color="D4DBE2"/>
+              <w:bottom w:val="single" w:sz="6" w:space="0" w:color="D4DBE2"/>
+              <w:right w:val="single" w:sz="6" w:space="0" w:color="D4DBE2"/>
+            </w:tcBorders>
+          </w:tcPr>
+          <w:p>
+            <w:pPr>
+              <w:pStyle w:val="Normal"/>
+              <w:spacing w:lineRule="auto" w:line="240" w:before="20" w:after="20"/>
+              <w:jc w:val="right"/>
+              <w:rPr/>
+            </w:pPr>
+            <w:r>
+              <w:rPr>
+                <w:b w:val="false"/>
+                <w:sz w:val="19"/>
+              </w:rPr>
+              <w:t>24,00</w:t>
+            </w:r>
+          </w:p>
+        </w:tc>
+      </w:tr>
+      <w:tr>
+        <w:trPr>
+          <w:cantSplit/>
+        </w:trPr>
+        <w:tc>
+          <w:tcPr>
+            <w:tcW w:w="2268" w:type="dxa"/>
+            <w:tcBorders>
+              <w:top w:val="single" w:sz="6" w:space="0" w:color="D4DBE2"/>
+              <w:left w:val="single" w:sz="6" w:space="0" w:color="D4DBE2"/>
+              <w:bottom w:val="single" w:sz="6" w:space="0" w:color="D4DBE2"/>
+              <w:right w:val="single" w:sz="6" w:space="0" w:color="D4DBE2"/>
+            </w:tcBorders>
+            <w:shd w:color="auto" w:fill="F2F4F6" w:val="clear"/>
+          </w:tcPr>
+          <w:p>
+            <w:pPr>
+              <w:pStyle w:val="Normal"/>
+              <w:spacing w:lineRule="auto" w:line="240" w:before="20" w:after="20"/>
+              <w:jc w:val="left"/>
+              <w:rPr/>
+            </w:pPr>
+            <w:r>
+              <w:rPr>
                 <w:b/>
                 <w:sz w:val="19"/>
               </w:rPr>
@@ -22090,6 +22288,7 @@
               <w:bottom w:val="single" w:sz="6" w:space="0" w:color="D4DBE2"/>
               <w:right w:val="single" w:sz="6" w:space="0" w:color="D4DBE2"/>
             </w:tcBorders>
+            <w:shd w:color="auto" w:fill="F2F4F6" w:val="clear"/>
           </w:tcPr>
           <w:p>
             <w:pPr>
@@ -22112,6 +22311,7 @@
               <w:bottom w:val="single" w:sz="6" w:space="0" w:color="D4DBE2"/>
               <w:right w:val="single" w:sz="6" w:space="0" w:color="D4DBE2"/>
             </w:tcBorders>
+            <w:shd w:color="auto" w:fill="F2F4F6" w:val="clear"/>
           </w:tcPr>
           <w:p>
             <w:pPr>
@@ -22134,6 +22334,7 @@
               <w:bottom w:val="single" w:sz="6" w:space="0" w:color="D4DBE2"/>
               <w:right w:val="single" w:sz="6" w:space="0" w:color="D4DBE2"/>
             </w:tcBorders>
+            <w:shd w:color="auto" w:fill="F2F4F6" w:val="clear"/>
           </w:tcPr>
           <w:p>
             <w:pPr>
@@ -22147,7 +22348,7 @@
                 <w:b/>
                 <w:sz w:val="19"/>
               </w:rPr>
-              <w:t>291,60</w:t>
+              <w:t>315,60</w:t>
             </w:r>
           </w:p>
         </w:tc>
@@ -22166,542 +22367,6 @@
           <w:sz w:val="22"/>
         </w:rPr>
         <w:t>Fonte: Cadastro dos processos de estadualização (2026).</w:t>
-      </w:r>
-    </w:p>
-    <w:p>
-      <w:pPr>
-        <w:pStyle w:val="Heading1"/>
-        <w:pBdr>
-          <w:top w:val="single" w:sz="12" w:space="8" w:color="C8860D"/>
-          <w:bottom w:val="single" w:sz="8" w:space="4" w:color="C9D2DC"/>
-        </w:pBdr>
-        <w:rPr/>
-      </w:pPr>
-      <w:bookmarkStart w:id="5" w:name="__RefHeading___Toc110083_720438169"/>
-      <w:bookmarkEnd w:id="5"/>
-      <w:r>
-        <w:rPr/>
-        <w:t>6 Dez números para citar</w:t>
-      </w:r>
-    </w:p>
-    <w:p>
-      <w:pPr>
-        <w:pStyle w:val="Normal"/>
-        <w:spacing w:lineRule="auto" w:line="312" w:before="0" w:after="80"/>
-        <w:ind w:hanging="283" w:left="567"/>
-        <w:jc w:val="both"/>
-        <w:rPr/>
-      </w:pPr>
-      <w:r>
-        <w:rPr>
-          <w:b/>
-          <w:color w:val="1A2B5E"/>
-          <w:sz w:val="22"/>
-        </w:rPr>
-        <w:t xml:space="preserve">• </w:t>
-      </w:r>
-      <w:r>
-        <w:rPr>
-          <w:b w:val="false"/>
-          <w:sz w:val="22"/>
-        </w:rPr>
-        <w:t xml:space="preserve">O Amazonas tem </w:t>
-      </w:r>
-      <w:r>
-        <w:rPr>
-          <w:b/>
-          <w:sz w:val="22"/>
-        </w:rPr>
-        <w:t>34 rodovias estaduais</w:t>
-      </w:r>
-      <w:r>
-        <w:rPr>
-          <w:b w:val="false"/>
-          <w:sz w:val="22"/>
-        </w:rPr>
-        <w:t xml:space="preserve"> e </w:t>
-      </w:r>
-      <w:r>
-        <w:rPr>
-          <w:b/>
-          <w:sz w:val="22"/>
-        </w:rPr>
-        <w:t>3.651 km</w:t>
-      </w:r>
-      <w:r>
-        <w:rPr>
-          <w:b w:val="false"/>
-          <w:sz w:val="22"/>
-        </w:rPr>
-        <w:t xml:space="preserve"> cadastrados, mas só </w:t>
-      </w:r>
-      <w:r>
-        <w:rPr>
-          <w:b/>
-          <w:sz w:val="22"/>
-        </w:rPr>
-        <w:t>1.156 km</w:t>
-      </w:r>
-      <w:r>
-        <w:rPr>
-          <w:b w:val="false"/>
-          <w:sz w:val="22"/>
-        </w:rPr>
-        <w:t xml:space="preserve"> existem no terreno. O resto, 2.267 km, é traçado previsto em lei que nunca foi construído.</w:t>
-      </w:r>
-    </w:p>
-    <w:p>
-      <w:pPr>
-        <w:pStyle w:val="Normal"/>
-        <w:spacing w:lineRule="auto" w:line="312" w:before="0" w:after="80"/>
-        <w:ind w:hanging="283" w:left="567"/>
-        <w:jc w:val="both"/>
-        <w:rPr/>
-      </w:pPr>
-      <w:r>
-        <w:rPr>
-          <w:b/>
-          <w:color w:val="1A2B5E"/>
-          <w:sz w:val="22"/>
-        </w:rPr>
-        <w:t xml:space="preserve">• </w:t>
-      </w:r>
-      <w:r>
-        <w:rPr>
-          <w:b w:val="false"/>
-          <w:sz w:val="22"/>
-        </w:rPr>
-        <w:t xml:space="preserve">A malha estadual pavimentada soma </w:t>
-      </w:r>
-      <w:r>
-        <w:rPr>
-          <w:b/>
-          <w:sz w:val="22"/>
-        </w:rPr>
-        <w:t>985 km</w:t>
-      </w:r>
-      <w:r>
-        <w:rPr>
-          <w:b w:val="false"/>
-          <w:sz w:val="22"/>
-        </w:rPr>
-        <w:t>, o equivalente a 28 % do cadastro.</w:t>
-      </w:r>
-    </w:p>
-    <w:p>
-      <w:pPr>
-        <w:pStyle w:val="Normal"/>
-        <w:spacing w:lineRule="auto" w:line="312" w:before="0" w:after="80"/>
-        <w:ind w:hanging="283" w:left="567"/>
-        <w:jc w:val="both"/>
-        <w:rPr/>
-      </w:pPr>
-      <w:r>
-        <w:rPr>
-          <w:b/>
-          <w:color w:val="1A2B5E"/>
-          <w:sz w:val="22"/>
-        </w:rPr>
-        <w:t xml:space="preserve">• </w:t>
-      </w:r>
-      <w:r>
-        <w:rPr>
-          <w:b w:val="false"/>
-          <w:sz w:val="22"/>
-        </w:rPr>
-        <w:t xml:space="preserve">Das rodovias federais no estado, </w:t>
-      </w:r>
-      <w:r>
-        <w:rPr>
-          <w:b/>
-          <w:sz w:val="22"/>
-        </w:rPr>
-        <w:t>6.476 km</w:t>
-      </w:r>
-      <w:r>
-        <w:rPr>
-          <w:b w:val="false"/>
-          <w:sz w:val="22"/>
-        </w:rPr>
-        <w:t xml:space="preserve"> no total, apenas </w:t>
-      </w:r>
-      <w:r>
-        <w:rPr>
-          <w:b/>
-          <w:sz w:val="22"/>
-        </w:rPr>
-        <w:t>935 km</w:t>
-      </w:r>
-      <w:r>
-        <w:rPr>
-          <w:b w:val="false"/>
-          <w:sz w:val="22"/>
-        </w:rPr>
-        <w:t xml:space="preserve"> têm pavimento, 14 % do que está cadastrado.</w:t>
-      </w:r>
-    </w:p>
-    <w:p>
-      <w:pPr>
-        <w:pStyle w:val="Normal"/>
-        <w:spacing w:lineRule="auto" w:line="312" w:before="0" w:after="80"/>
-        <w:ind w:hanging="283" w:left="567"/>
-        <w:jc w:val="both"/>
-        <w:rPr/>
-      </w:pPr>
-      <w:r>
-        <w:rPr>
-          <w:b/>
-          <w:color w:val="1A2B5E"/>
-          <w:sz w:val="22"/>
-        </w:rPr>
-        <w:t xml:space="preserve">• </w:t>
-      </w:r>
-      <w:r>
-        <w:rPr>
-          <w:b w:val="false"/>
-          <w:sz w:val="22"/>
-        </w:rPr>
-        <w:t xml:space="preserve">A </w:t>
-      </w:r>
-      <w:r>
-        <w:rPr>
-          <w:b/>
-          <w:sz w:val="22"/>
-        </w:rPr>
-        <w:t>BR-319</w:t>
-      </w:r>
-      <w:r>
-        <w:rPr>
-          <w:b w:val="false"/>
-          <w:sz w:val="22"/>
-        </w:rPr>
-        <w:t xml:space="preserve"> é a única ligação terrestre entre Manaus e o resto do país, e 390,8 km dela seguem sem pavimento.</w:t>
-      </w:r>
-    </w:p>
-    <w:p>
-      <w:pPr>
-        <w:pStyle w:val="Normal"/>
-        <w:spacing w:lineRule="auto" w:line="312" w:before="0" w:after="80"/>
-        <w:ind w:hanging="283" w:left="567"/>
-        <w:jc w:val="both"/>
-        <w:rPr/>
-      </w:pPr>
-      <w:r>
-        <w:rPr>
-          <w:b/>
-          <w:color w:val="1A2B5E"/>
-          <w:sz w:val="22"/>
-        </w:rPr>
-        <w:t xml:space="preserve">• </w:t>
-      </w:r>
-      <w:r>
-        <w:rPr>
-          <w:b w:val="false"/>
-          <w:sz w:val="22"/>
-        </w:rPr>
-        <w:t xml:space="preserve">A frota do estado saltou de </w:t>
-      </w:r>
-      <w:r>
-        <w:rPr>
-          <w:b/>
-          <w:sz w:val="22"/>
-        </w:rPr>
-        <w:t>589.780</w:t>
-      </w:r>
-      <w:r>
-        <w:rPr>
-          <w:b w:val="false"/>
-          <w:sz w:val="22"/>
-        </w:rPr>
-        <w:t xml:space="preserve"> veículos em 2011 para </w:t>
-      </w:r>
-      <w:r>
-        <w:rPr>
-          <w:b/>
-          <w:sz w:val="22"/>
-        </w:rPr>
-        <w:t>1.279.847</w:t>
-      </w:r>
-      <w:r>
-        <w:rPr>
-          <w:b w:val="false"/>
-          <w:sz w:val="22"/>
-        </w:rPr>
-        <w:t xml:space="preserve"> em 2025, alta de 117 %, e Manaus concentra 79 % desse total.</w:t>
-      </w:r>
-    </w:p>
-    <w:p>
-      <w:pPr>
-        <w:pStyle w:val="Normal"/>
-        <w:spacing w:lineRule="auto" w:line="312" w:before="0" w:after="80"/>
-        <w:ind w:hanging="283" w:left="567"/>
-        <w:jc w:val="both"/>
-        <w:rPr/>
-      </w:pPr>
-      <w:r>
-        <w:rPr>
-          <w:b/>
-          <w:color w:val="1A2B5E"/>
-          <w:sz w:val="22"/>
-        </w:rPr>
-        <w:t xml:space="preserve">• </w:t>
-      </w:r>
-      <w:r>
-        <w:rPr>
-          <w:b w:val="false"/>
-          <w:sz w:val="22"/>
-        </w:rPr>
-        <w:t xml:space="preserve">A </w:t>
-      </w:r>
-      <w:r>
-        <w:rPr>
-          <w:b/>
-          <w:sz w:val="22"/>
-        </w:rPr>
-        <w:t>AM-070</w:t>
-      </w:r>
-      <w:r>
-        <w:rPr>
-          <w:b w:val="false"/>
-          <w:sz w:val="22"/>
-        </w:rPr>
-        <w:t xml:space="preserve"> é a rodovia estadual de maior movimento fora da área urbana de Manaus: cerca de </w:t>
-      </w:r>
-      <w:r>
-        <w:rPr>
-          <w:b/>
-          <w:sz w:val="22"/>
-        </w:rPr>
-        <w:t>10.021 veículos por dia</w:t>
-      </w:r>
-      <w:r>
-        <w:rPr>
-          <w:b w:val="false"/>
-          <w:sz w:val="22"/>
-        </w:rPr>
-        <w:t>. Em 2011, semanas depois da inauguração da ponte sobre o rio Negro, o tráfego dela quadruplicou.</w:t>
-      </w:r>
-    </w:p>
-    <w:p>
-      <w:pPr>
-        <w:pStyle w:val="Normal"/>
-        <w:spacing w:lineRule="auto" w:line="312" w:before="0" w:after="80"/>
-        <w:ind w:hanging="283" w:left="567"/>
-        <w:jc w:val="both"/>
-        <w:rPr/>
-      </w:pPr>
-      <w:r>
-        <w:rPr>
-          <w:b/>
-          <w:color w:val="1A2B5E"/>
-          <w:sz w:val="22"/>
-        </w:rPr>
-        <w:t xml:space="preserve">• </w:t>
-      </w:r>
-      <w:r>
-        <w:rPr>
-          <w:b w:val="false"/>
-          <w:sz w:val="22"/>
-        </w:rPr>
-        <w:t xml:space="preserve">A </w:t>
-      </w:r>
-      <w:r>
-        <w:rPr>
-          <w:b/>
-          <w:sz w:val="22"/>
-        </w:rPr>
-        <w:t>AM-010</w:t>
-      </w:r>
-      <w:r>
-        <w:rPr>
-          <w:b w:val="false"/>
-          <w:sz w:val="22"/>
-        </w:rPr>
-        <w:t xml:space="preserve">, que liga Manaus a Itacoatiara, carrega hoje cerca de </w:t>
-      </w:r>
-      <w:r>
-        <w:rPr>
-          <w:b/>
-          <w:sz w:val="22"/>
-        </w:rPr>
-        <w:t>5.600 veículos por dia</w:t>
-      </w:r>
-      <w:r>
-        <w:rPr>
-          <w:b w:val="false"/>
-          <w:sz w:val="22"/>
-        </w:rPr>
-        <w:t xml:space="preserve"> e dá acesso ao porto de águas profundas de Itacoatiara.</w:t>
-      </w:r>
-    </w:p>
-    <w:p>
-      <w:pPr>
-        <w:pStyle w:val="Normal"/>
-        <w:spacing w:lineRule="auto" w:line="312" w:before="0" w:after="80"/>
-        <w:ind w:hanging="283" w:left="567"/>
-        <w:jc w:val="both"/>
-        <w:rPr/>
-      </w:pPr>
-      <w:r>
-        <w:rPr>
-          <w:b/>
-          <w:color w:val="1A2B5E"/>
-          <w:sz w:val="22"/>
-        </w:rPr>
-        <w:t xml:space="preserve">• </w:t>
-      </w:r>
-      <w:r>
-        <w:rPr>
-          <w:b w:val="false"/>
-          <w:sz w:val="22"/>
-        </w:rPr>
-        <w:t xml:space="preserve">O cadastro reúne </w:t>
-      </w:r>
-      <w:r>
-        <w:rPr>
-          <w:b/>
-          <w:sz w:val="22"/>
-        </w:rPr>
-        <w:t>906 ramais</w:t>
-      </w:r>
-      <w:r>
-        <w:rPr>
-          <w:b w:val="false"/>
-          <w:sz w:val="22"/>
-        </w:rPr>
-        <w:t xml:space="preserve"> e </w:t>
-      </w:r>
-      <w:r>
-        <w:rPr>
-          <w:b/>
-          <w:sz w:val="22"/>
-        </w:rPr>
-        <w:t>6.298 km</w:t>
-      </w:r>
-      <w:r>
-        <w:rPr>
-          <w:b w:val="false"/>
-          <w:sz w:val="22"/>
-        </w:rPr>
-        <w:t xml:space="preserve"> de estradas vicinais, 93 % em leito natural. São eles que levam a produção rural até a rodovia.</w:t>
-      </w:r>
-    </w:p>
-    <w:p>
-      <w:pPr>
-        <w:pStyle w:val="Normal"/>
-        <w:spacing w:lineRule="auto" w:line="312" w:before="0" w:after="80"/>
-        <w:ind w:hanging="283" w:left="567"/>
-        <w:jc w:val="both"/>
-        <w:rPr/>
-      </w:pPr>
-      <w:r>
-        <w:rPr>
-          <w:b/>
-          <w:color w:val="1A2B5E"/>
-          <w:sz w:val="22"/>
-        </w:rPr>
-        <w:t xml:space="preserve">• </w:t>
-      </w:r>
-      <w:r>
-        <w:rPr>
-          <w:b w:val="false"/>
-          <w:sz w:val="22"/>
-        </w:rPr>
-        <w:t xml:space="preserve">A condição do pavimento foi medida em </w:t>
-      </w:r>
-      <w:r>
-        <w:rPr>
-          <w:b/>
-          <w:sz w:val="22"/>
-        </w:rPr>
-        <w:t>13 rodovias</w:t>
-      </w:r>
-      <w:r>
-        <w:rPr>
-          <w:b w:val="false"/>
-          <w:sz w:val="22"/>
-        </w:rPr>
-        <w:t xml:space="preserve"> e </w:t>
-      </w:r>
-      <w:r>
-        <w:rPr>
-          <w:b/>
-          <w:sz w:val="22"/>
-        </w:rPr>
-        <w:t>636 km</w:t>
-      </w:r>
-      <w:r>
-        <w:rPr>
-          <w:b w:val="false"/>
-          <w:sz w:val="22"/>
-        </w:rPr>
-        <w:t xml:space="preserve"> na campanha de 2024. O pior resultado está em acessos curtos de sede municipal, como a AM-328, com IRI de 9,14 m/km.</w:t>
-      </w:r>
-    </w:p>
-    <w:p>
-      <w:pPr>
-        <w:pStyle w:val="Normal"/>
-        <w:spacing w:lineRule="auto" w:line="312" w:before="0" w:after="80"/>
-        <w:ind w:hanging="283" w:left="567"/>
-        <w:jc w:val="both"/>
-        <w:rPr/>
-      </w:pPr>
-      <w:r>
-        <w:rPr>
-          <w:b/>
-          <w:color w:val="1A2B5E"/>
-          <w:sz w:val="22"/>
-        </w:rPr>
-        <w:t xml:space="preserve">• </w:t>
-      </w:r>
-      <w:r>
-        <w:rPr>
-          <w:b w:val="false"/>
-          <w:sz w:val="22"/>
-        </w:rPr>
-        <w:t xml:space="preserve">A última criação de rodovias estaduais foi em </w:t>
-      </w:r>
-      <w:r>
-        <w:rPr>
-          <w:b/>
-          <w:sz w:val="22"/>
-        </w:rPr>
-        <w:t>2021</w:t>
-      </w:r>
-      <w:r>
-        <w:rPr>
-          <w:b w:val="false"/>
-          <w:sz w:val="22"/>
-        </w:rPr>
-        <w:t xml:space="preserve">, quando a Lei n.º 5.692 incorporou </w:t>
-      </w:r>
-      <w:r>
-        <w:rPr>
-          <w:b/>
-          <w:sz w:val="22"/>
-        </w:rPr>
-        <w:t>5 estradas vicinais</w:t>
-      </w:r>
-      <w:r>
-        <w:rPr>
-          <w:b w:val="false"/>
-          <w:sz w:val="22"/>
-        </w:rPr>
-        <w:t xml:space="preserve"> (75,8 km). Outros </w:t>
-      </w:r>
-      <w:r>
-        <w:rPr>
-          <w:b/>
-          <w:sz w:val="22"/>
-        </w:rPr>
-        <w:t>10 trechos</w:t>
-      </w:r>
-      <w:r>
-        <w:rPr>
-          <w:b w:val="false"/>
-          <w:sz w:val="22"/>
-        </w:rPr>
-        <w:t xml:space="preserve"> (291,6 km) aguardam decisão.</w:t>
       </w:r>
     </w:p>
     <w:sectPr>
@@ -22783,7 +22448,7 @@
         <w:color w:val="5A6673"/>
         <w:sz w:val="17"/>
       </w:rPr>
-      <w:t>10</w:t>
+      <w:t>9</w:t>
     </w:r>
     <w:r>
       <w:rPr>

</xml_diff>

<commit_message>
Dossiê de aeródromos do Amazonas; estadualização com Estrada Borba/Mapiá (AM-148) e Estrada do Axinim (AM-357) e capítulo de nomenclatura
Co-Authored-By: Claude Opus 5 <noreply@anthropic.com>
</commit_message>
<xml_diff>
--- a/documentos/Resumo_Referencia_Rodovias.docx
+++ b/documentos/Resumo_Referencia_Rodovias.docx
@@ -385,7 +385,7 @@
             </w:rPr>
             <w:fldChar w:fldCharType="separate"/>
           </w:r>
-          <w:hyperlink w:anchor="__RefHeading___Toc35786_2662203589" w:tooltip="1. Rodovias estaduais">
+          <w:hyperlink w:anchor="__RefHeading___Toc51959_2662203589" w:tooltip="1. Rodovias estaduais">
             <w:r>
               <w:rPr>
                 <w:rStyle w:val="Vnculodendice"/>
@@ -406,7 +406,7 @@
             </w:tabs>
             <w:rPr/>
           </w:pPr>
-          <w:hyperlink w:anchor="__RefHeading___Toc35788_2662203589" w:tooltip="2. Rodovias federais no Amazonas">
+          <w:hyperlink w:anchor="__RefHeading___Toc51961_2662203589" w:tooltip="2. Rodovias federais no Amazonas">
             <w:r>
               <w:rPr>
                 <w:rStyle w:val="Vnculodendice"/>
@@ -427,7 +427,7 @@
             </w:tabs>
             <w:rPr/>
           </w:pPr>
-          <w:hyperlink w:anchor="__RefHeading___Toc35790_2662203589" w:tooltip="3. Ramais e estradas vicinais">
+          <w:hyperlink w:anchor="__RefHeading___Toc51963_2662203589" w:tooltip="3. Ramais e estradas vicinais">
             <w:r>
               <w:rPr>
                 <w:rStyle w:val="Vnculodendice"/>
@@ -448,7 +448,7 @@
             </w:tabs>
             <w:rPr/>
           </w:pPr>
-          <w:hyperlink w:anchor="__RefHeading___Toc35792_2662203589" w:tooltip="4. Obras de arte especiais">
+          <w:hyperlink w:anchor="__RefHeading___Toc51965_2662203589" w:tooltip="4. Obras de arte especiais">
             <w:r>
               <w:rPr>
                 <w:rStyle w:val="Vnculodendice"/>
@@ -469,7 +469,7 @@
             </w:tabs>
             <w:rPr/>
           </w:pPr>
-          <w:hyperlink w:anchor="__RefHeading___Toc35794_2662203589" w:tooltip="5. Estadualização de estradas vicinais">
+          <w:hyperlink w:anchor="__RefHeading___Toc51967_2662203589" w:tooltip="5. Estadualização de estradas vicinais">
             <w:r>
               <w:rPr>
                 <w:rStyle w:val="Vnculodendice"/>
@@ -511,7 +511,7 @@
         <w:spacing w:before="0" w:after="160"/>
         <w:rPr/>
       </w:pPr>
-      <w:bookmarkStart w:id="0" w:name="__RefHeading___Toc35786_2662203589"/>
+      <w:bookmarkStart w:id="0" w:name="__RefHeading___Toc51959_2662203589"/>
       <w:bookmarkEnd w:id="0"/>
       <w:r>
         <w:rPr/>
@@ -8286,7 +8286,7 @@
         </w:pBdr>
         <w:rPr/>
       </w:pPr>
-      <w:bookmarkStart w:id="1" w:name="__RefHeading___Toc35788_2662203589"/>
+      <w:bookmarkStart w:id="1" w:name="__RefHeading___Toc51961_2662203589"/>
       <w:bookmarkEnd w:id="1"/>
       <w:r>
         <w:rPr/>
@@ -10963,7 +10963,7 @@
         </w:pBdr>
         <w:rPr/>
       </w:pPr>
-      <w:bookmarkStart w:id="2" w:name="__RefHeading___Toc35790_2662203589"/>
+      <w:bookmarkStart w:id="2" w:name="__RefHeading___Toc51963_2662203589"/>
       <w:bookmarkEnd w:id="2"/>
       <w:r>
         <w:rPr/>
@@ -17984,7 +17984,7 @@
         </w:pBdr>
         <w:rPr/>
       </w:pPr>
-      <w:bookmarkStart w:id="3" w:name="__RefHeading___Toc35792_2662203589"/>
+      <w:bookmarkStart w:id="3" w:name="__RefHeading___Toc51965_2662203589"/>
       <w:bookmarkEnd w:id="3"/>
       <w:r>
         <w:rPr/>
@@ -19582,7 +19582,7 @@
         </w:pBdr>
         <w:rPr/>
       </w:pPr>
-      <w:bookmarkStart w:id="4" w:name="__RefHeading___Toc35794_2662203589"/>
+      <w:bookmarkStart w:id="4" w:name="__RefHeading___Toc51967_2662203589"/>
       <w:bookmarkEnd w:id="4"/>
       <w:r>
         <w:rPr/>
@@ -19690,7 +19690,7 @@
                 <w:color w:val="1A2B5E"/>
                 <w:sz w:val="34"/>
               </w:rPr>
-              <w:t>11</w:t>
+              <w:t>12</w:t>
             </w:r>
           </w:p>
         </w:tc>
@@ -19805,7 +19805,7 @@
                 <w:color w:val="1A2B5E"/>
                 <w:sz w:val="34"/>
               </w:rPr>
-              <w:t>315,6 km</w:t>
+              <w:t>351,7 km</w:t>
             </w:r>
           </w:p>
         </w:tc>
@@ -22165,7 +22165,7 @@
                 <w:b w:val="false"/>
                 <w:sz w:val="19"/>
               </w:rPr>
-              <w:t>AM-149</w:t>
+              <w:t>AM-148</w:t>
             </w:r>
           </w:p>
         </w:tc>
@@ -22243,7 +22243,7 @@
                 <w:b w:val="false"/>
                 <w:sz w:val="19"/>
               </w:rPr>
-              <w:t>24,00</w:t>
+              <w:t>23,60</w:t>
             </w:r>
           </w:p>
         </w:tc>
@@ -22272,6 +22272,118 @@
             </w:pPr>
             <w:r>
               <w:rPr>
+                <w:b w:val="false"/>
+                <w:sz w:val="19"/>
+              </w:rPr>
+              <w:t>AM-357</w:t>
+            </w:r>
+          </w:p>
+        </w:tc>
+        <w:tc>
+          <w:tcPr>
+            <w:tcW w:w="2268" w:type="dxa"/>
+            <w:tcBorders>
+              <w:top w:val="single" w:sz="6" w:space="0" w:color="D4DBE2"/>
+              <w:left w:val="single" w:sz="6" w:space="0" w:color="D4DBE2"/>
+              <w:bottom w:val="single" w:sz="6" w:space="0" w:color="D4DBE2"/>
+              <w:right w:val="single" w:sz="6" w:space="0" w:color="D4DBE2"/>
+            </w:tcBorders>
+            <w:shd w:color="auto" w:fill="F2F4F6" w:val="clear"/>
+          </w:tcPr>
+          <w:p>
+            <w:pPr>
+              <w:pStyle w:val="Normal"/>
+              <w:spacing w:lineRule="auto" w:line="240" w:before="20" w:after="20"/>
+              <w:jc w:val="left"/>
+              <w:rPr/>
+            </w:pPr>
+            <w:r>
+              <w:rPr>
+                <w:b w:val="false"/>
+                <w:sz w:val="19"/>
+              </w:rPr>
+              <w:t>Estrada do Axinim</w:t>
+            </w:r>
+          </w:p>
+        </w:tc>
+        <w:tc>
+          <w:tcPr>
+            <w:tcW w:w="2268" w:type="dxa"/>
+            <w:tcBorders>
+              <w:top w:val="single" w:sz="6" w:space="0" w:color="D4DBE2"/>
+              <w:left w:val="single" w:sz="6" w:space="0" w:color="D4DBE2"/>
+              <w:bottom w:val="single" w:sz="6" w:space="0" w:color="D4DBE2"/>
+              <w:right w:val="single" w:sz="6" w:space="0" w:color="D4DBE2"/>
+            </w:tcBorders>
+            <w:shd w:color="auto" w:fill="F2F4F6" w:val="clear"/>
+          </w:tcPr>
+          <w:p>
+            <w:pPr>
+              <w:pStyle w:val="Normal"/>
+              <w:spacing w:lineRule="auto" w:line="240" w:before="20" w:after="20"/>
+              <w:jc w:val="left"/>
+              <w:rPr/>
+            </w:pPr>
+            <w:r>
+              <w:rPr>
+                <w:b w:val="false"/>
+                <w:sz w:val="19"/>
+              </w:rPr>
+              <w:t>Autazes e Borba</w:t>
+            </w:r>
+          </w:p>
+        </w:tc>
+        <w:tc>
+          <w:tcPr>
+            <w:tcW w:w="2268" w:type="dxa"/>
+            <w:tcBorders>
+              <w:top w:val="single" w:sz="6" w:space="0" w:color="D4DBE2"/>
+              <w:left w:val="single" w:sz="6" w:space="0" w:color="D4DBE2"/>
+              <w:bottom w:val="single" w:sz="6" w:space="0" w:color="D4DBE2"/>
+              <w:right w:val="single" w:sz="6" w:space="0" w:color="D4DBE2"/>
+            </w:tcBorders>
+            <w:shd w:color="auto" w:fill="F2F4F6" w:val="clear"/>
+          </w:tcPr>
+          <w:p>
+            <w:pPr>
+              <w:pStyle w:val="Normal"/>
+              <w:spacing w:lineRule="auto" w:line="240" w:before="20" w:after="20"/>
+              <w:jc w:val="right"/>
+              <w:rPr/>
+            </w:pPr>
+            <w:r>
+              <w:rPr>
+                <w:b w:val="false"/>
+                <w:sz w:val="19"/>
+              </w:rPr>
+              <w:t>36,50</w:t>
+            </w:r>
+          </w:p>
+        </w:tc>
+      </w:tr>
+      <w:tr>
+        <w:trPr>
+          <w:cantSplit/>
+        </w:trPr>
+        <w:tc>
+          <w:tcPr>
+            <w:tcW w:w="2268" w:type="dxa"/>
+            <w:tcBorders>
+              <w:top w:val="single" w:sz="6" w:space="0" w:color="D4DBE2"/>
+              <w:left w:val="single" w:sz="6" w:space="0" w:color="D4DBE2"/>
+              <w:bottom w:val="single" w:sz="6" w:space="0" w:color="D4DBE2"/>
+              <w:right w:val="single" w:sz="6" w:space="0" w:color="D4DBE2"/>
+            </w:tcBorders>
+          </w:tcPr>
+          <w:p>
+            <w:pPr>
+              <w:pStyle w:val="Normal"/>
+              <w:spacing w:lineRule="auto" w:line="240" w:before="20" w:after="20"/>
+              <w:jc w:val="left"/>
+              <w:rPr/>
+            </w:pPr>
+            <w:r>
+              <w:rPr>
                 <w:b/>
                 <w:sz w:val="19"/>
               </w:rPr>
@@ -22288,7 +22400,6 @@
               <w:bottom w:val="single" w:sz="6" w:space="0" w:color="D4DBE2"/>
               <w:right w:val="single" w:sz="6" w:space="0" w:color="D4DBE2"/>
             </w:tcBorders>
-            <w:shd w:color="auto" w:fill="F2F4F6" w:val="clear"/>
           </w:tcPr>
           <w:p>
             <w:pPr>
@@ -22311,7 +22422,6 @@
               <w:bottom w:val="single" w:sz="6" w:space="0" w:color="D4DBE2"/>
               <w:right w:val="single" w:sz="6" w:space="0" w:color="D4DBE2"/>
             </w:tcBorders>
-            <w:shd w:color="auto" w:fill="F2F4F6" w:val="clear"/>
           </w:tcPr>
           <w:p>
             <w:pPr>
@@ -22334,7 +22444,6 @@
               <w:bottom w:val="single" w:sz="6" w:space="0" w:color="D4DBE2"/>
               <w:right w:val="single" w:sz="6" w:space="0" w:color="D4DBE2"/>
             </w:tcBorders>
-            <w:shd w:color="auto" w:fill="F2F4F6" w:val="clear"/>
           </w:tcPr>
           <w:p>
             <w:pPr>
@@ -22348,7 +22457,7 @@
                 <w:b/>
                 <w:sz w:val="19"/>
               </w:rPr>
-              <w:t>315,60</w:t>
+              <w:t>351,70</w:t>
             </w:r>
           </w:p>
         </w:tc>

</xml_diff>